<commit_message>
Apply HR's own manual formatting edits to Increment Letter template
Swapped in the .docx as edited directly in Word by HR. Verified before
committing: all 55 bracket placeholders match exactly (none renamed,
removed, or broken), the letterhead background image still extracts
correctly, and the template renders cleanly through the real app
pipeline (getTemplateFields/renderTemplateDocx, mammoth round-trip
with zero warnings) — this is a manual formatting pass, not a
generated change, so the whole point of verifying was confirming HR's
edits didn't accidentally break something Word-editing can silently
corrupt (a split placeholder, a detached background image), not
reviewing the formatting choices themselves.

Co-Authored-By: Claude Sonnet 5 <noreply@anthropic.com>
Claude-Session: https://claude.ai/code/session_01MEHPF7p4Mvi3Bv2am4sPQK
</commit_message>
<xml_diff>
--- a/hr-ai-interviewer/backend/src/templates/increment-letter.docx
+++ b/hr-ai-interviewer/backend/src/templates/increment-letter.docx
@@ -1128,7 +1128,7 @@
           <w:szCs w:val="21"/>
         </w:rPr>
         <w:drawing>
-          <wp:anchor distT="0" distB="0" distL="114300" distR="114300" simplePos="0" relativeHeight="251672576" behindDoc="1" locked="0" layoutInCell="1" allowOverlap="1" wp14:anchorId="65F0A772" wp14:editId="7EC87B4D">
+          <wp:anchor distT="0" distB="0" distL="114300" distR="114300" simplePos="0" relativeHeight="251672576" behindDoc="1" locked="0" layoutInCell="1" allowOverlap="1" wp14:anchorId="65F0A772" wp14:editId="5AB6BA83">
             <wp:simplePos x="0" y="0"/>
             <wp:positionH relativeFrom="page">
               <wp:posOffset>0</wp:posOffset>
@@ -1205,13 +1205,13 @@
           <w:noProof/>
         </w:rPr>
         <w:drawing>
-          <wp:anchor distT="0" distB="0" distL="114300" distR="114300" simplePos="0" relativeHeight="251665408" behindDoc="0" locked="0" layoutInCell="1" allowOverlap="1" wp14:anchorId="402FAF3F" wp14:editId="5499FC17">
+          <wp:anchor distT="0" distB="0" distL="114300" distR="114300" simplePos="0" relativeHeight="251665408" behindDoc="0" locked="0" layoutInCell="1" allowOverlap="1" wp14:anchorId="402FAF3F" wp14:editId="5819415F">
             <wp:simplePos x="0" y="0"/>
             <wp:positionH relativeFrom="margin">
-              <wp:posOffset>21590</wp:posOffset>
+              <wp:posOffset>-33057</wp:posOffset>
             </wp:positionH>
             <wp:positionV relativeFrom="paragraph">
-              <wp:posOffset>5237371</wp:posOffset>
+              <wp:posOffset>5495925</wp:posOffset>
             </wp:positionV>
             <wp:extent cx="565785" cy="565150"/>
             <wp:effectExtent l="0" t="0" r="5715" b="6350"/>
@@ -3260,6 +3260,16 @@
       <w:pPr>
         <w:rPr>
           <w:rFonts w:ascii="Sylfaen" w:hAnsi="Sylfaen" w:cs="Arial"/>
+        </w:rPr>
+      </w:pPr>
+    </w:p>
+    <w:p>
+      <w:pPr>
+        <w:rPr>
+          <w:rFonts w:ascii="Sylfaen" w:eastAsia="Arial" w:hAnsi="Sylfaen" w:cs="Arial"/>
+          <w:color w:val="2C2C2C"/>
+          <w:sz w:val="21"/>
+          <w:szCs w:val="21"/>
         </w:rPr>
       </w:pPr>
     </w:p>

</xml_diff>

<commit_message>
Apply second round of manual formatting edits to Increment Letter template
User-edited version uploaded via the manual round-trip workflow. Verified
before merging: all 55 bracket placeholders match exactly (none added,
removed, or renamed), the letterhead background image still extracts
correctly, the field-discovery/render pipeline (documentTemplates.js)
completes without error, and a mammoth conversion of the rendered output
produces zero warnings with expected content (TOTAL CTC, Best Regards)
intact. Both page-margin sections (1000/1700 twips) are unchanged, so this
round only carries other formatting tweaks made in Word.

Co-Authored-By: Claude Sonnet 5 <noreply@anthropic.com>
Claude-Session: https://claude.ai/code/session_01MEHPF7p4Mvi3Bv2am4sPQK
</commit_message>
<xml_diff>
--- a/hr-ai-interviewer/backend/src/templates/increment-letter.docx
+++ b/hr-ai-interviewer/backend/src/templates/increment-letter.docx
@@ -18,7 +18,7 @@
           <w:szCs w:val="21"/>
         </w:rPr>
         <w:drawing>
-          <wp:anchor distT="0" distB="0" distL="114300" distR="114300" simplePos="0" relativeHeight="251669504" behindDoc="1" locked="0" layoutInCell="1" allowOverlap="1" wp14:anchorId="1A08C66C" wp14:editId="6D29938C">
+          <wp:anchor distT="0" distB="0" distL="114300" distR="114300" simplePos="0" relativeHeight="251669504" behindDoc="1" locked="0" layoutInCell="1" allowOverlap="1" wp14:anchorId="1A08C66C" wp14:editId="589929C8">
             <wp:simplePos x="0" y="0"/>
             <wp:positionH relativeFrom="page">
               <wp:posOffset>7620</wp:posOffset>
@@ -1128,7 +1128,7 @@
           <w:szCs w:val="21"/>
         </w:rPr>
         <w:drawing>
-          <wp:anchor distT="0" distB="0" distL="114300" distR="114300" simplePos="0" relativeHeight="251672576" behindDoc="1" locked="0" layoutInCell="1" allowOverlap="1" wp14:anchorId="65F0A772" wp14:editId="5AB6BA83">
+          <wp:anchor distT="0" distB="0" distL="114300" distR="114300" simplePos="0" relativeHeight="251672576" behindDoc="1" locked="0" layoutInCell="1" allowOverlap="1" wp14:anchorId="65F0A772" wp14:editId="430E01BF">
             <wp:simplePos x="0" y="0"/>
             <wp:positionH relativeFrom="page">
               <wp:posOffset>0</wp:posOffset>
@@ -1205,13 +1205,13 @@
           <w:noProof/>
         </w:rPr>
         <w:drawing>
-          <wp:anchor distT="0" distB="0" distL="114300" distR="114300" simplePos="0" relativeHeight="251665408" behindDoc="0" locked="0" layoutInCell="1" allowOverlap="1" wp14:anchorId="402FAF3F" wp14:editId="5819415F">
+          <wp:anchor distT="0" distB="0" distL="114300" distR="114300" simplePos="0" relativeHeight="251665408" behindDoc="0" locked="0" layoutInCell="1" allowOverlap="1" wp14:anchorId="402FAF3F" wp14:editId="0D0A7897">
             <wp:simplePos x="0" y="0"/>
             <wp:positionH relativeFrom="margin">
-              <wp:posOffset>-33057</wp:posOffset>
+              <wp:posOffset>-33020</wp:posOffset>
             </wp:positionH>
             <wp:positionV relativeFrom="paragraph">
-              <wp:posOffset>5495925</wp:posOffset>
+              <wp:posOffset>5452907</wp:posOffset>
             </wp:positionV>
             <wp:extent cx="565785" cy="565150"/>
             <wp:effectExtent l="0" t="0" r="5715" b="6350"/>
@@ -1257,7 +1257,7 @@
       <w:tblPr>
         <w:tblStyle w:val="TableGrid"/>
         <w:tblpPr w:leftFromText="180" w:rightFromText="180" w:vertAnchor="text" w:horzAnchor="margin" w:tblpY="-29"/>
-        <w:tblW w:w="9696" w:type="dxa"/>
+        <w:tblW w:w="9920" w:type="dxa"/>
         <w:tblBorders>
           <w:top w:val="single" w:sz="2" w:space="0" w:color="BFBFBF" w:themeColor="background1" w:themeShade="BF"/>
           <w:left w:val="single" w:sz="2" w:space="0" w:color="BFBFBF" w:themeColor="background1" w:themeShade="BF"/>
@@ -1269,10 +1269,10 @@
         <w:tblLook w:val="04A0" w:firstRow="1" w:lastRow="0" w:firstColumn="1" w:lastColumn="0" w:noHBand="0" w:noVBand="1"/>
       </w:tblPr>
       <w:tblGrid>
-        <w:gridCol w:w="2974"/>
+        <w:gridCol w:w="2549"/>
+        <w:gridCol w:w="2693"/>
         <w:gridCol w:w="2268"/>
         <w:gridCol w:w="2410"/>
-        <w:gridCol w:w="2044"/>
       </w:tblGrid>
       <w:tr>
         <w:trPr>
@@ -1280,7 +1280,7 @@
         </w:trPr>
         <w:tc>
           <w:tcPr>
-            <w:tcW w:w="2974" w:type="dxa"/>
+            <w:tcW w:w="2549" w:type="dxa"/>
             <w:shd w:val="clear" w:color="auto" w:fill="1F3864" w:themeFill="accent1" w:themeFillShade="80"/>
             <w:vAlign w:val="center"/>
           </w:tcPr>
@@ -1302,6 +1302,34 @@
                 <w:szCs w:val="18"/>
               </w:rPr>
               <w:t>Component</w:t>
+            </w:r>
+          </w:p>
+        </w:tc>
+        <w:tc>
+          <w:tcPr>
+            <w:tcW w:w="2693" w:type="dxa"/>
+            <w:shd w:val="clear" w:color="auto" w:fill="1F3864" w:themeFill="accent1" w:themeFillShade="80"/>
+            <w:vAlign w:val="center"/>
+          </w:tcPr>
+          <w:p>
+            <w:pPr>
+              <w:jc w:val="right"/>
+              <w:rPr>
+                <w:rFonts w:ascii="Sylfaen" w:hAnsi="Sylfaen" w:cs="Arial"/>
+                <w:sz w:val="18"/>
+                <w:szCs w:val="18"/>
+              </w:rPr>
+            </w:pPr>
+            <w:r>
+              <w:rPr>
+                <w:rFonts w:ascii="Sylfaen" w:eastAsia="Arial" w:hAnsi="Sylfaen" w:cs="Arial"/>
+                <w:b/>
+                <w:bCs/>
+                <w:color w:val="FFFFFF"/>
+                <w:sz w:val="18"/>
+                <w:szCs w:val="18"/>
+              </w:rPr>
+              <w:t>Existing (Monthly)</w:t>
             </w:r>
           </w:p>
         </w:tc>
@@ -1329,41 +1357,13 @@
                 <w:sz w:val="18"/>
                 <w:szCs w:val="18"/>
               </w:rPr>
-              <w:t>Existing (Monthly)</w:t>
+              <w:t>New (Monthly)</w:t>
             </w:r>
           </w:p>
         </w:tc>
         <w:tc>
           <w:tcPr>
             <w:tcW w:w="2410" w:type="dxa"/>
-            <w:shd w:val="clear" w:color="auto" w:fill="1F3864" w:themeFill="accent1" w:themeFillShade="80"/>
-            <w:vAlign w:val="center"/>
-          </w:tcPr>
-          <w:p>
-            <w:pPr>
-              <w:jc w:val="right"/>
-              <w:rPr>
-                <w:rFonts w:ascii="Sylfaen" w:hAnsi="Sylfaen" w:cs="Arial"/>
-                <w:sz w:val="18"/>
-                <w:szCs w:val="18"/>
-              </w:rPr>
-            </w:pPr>
-            <w:r>
-              <w:rPr>
-                <w:rFonts w:ascii="Sylfaen" w:eastAsia="Arial" w:hAnsi="Sylfaen" w:cs="Arial"/>
-                <w:b/>
-                <w:bCs/>
-                <w:color w:val="FFFFFF"/>
-                <w:sz w:val="18"/>
-                <w:szCs w:val="18"/>
-              </w:rPr>
-              <w:t>New (Monthly)</w:t>
-            </w:r>
-          </w:p>
-        </w:tc>
-        <w:tc>
-          <w:tcPr>
-            <w:tcW w:w="2044" w:type="dxa"/>
             <w:shd w:val="clear" w:color="auto" w:fill="1F3864" w:themeFill="accent1" w:themeFillShade="80"/>
             <w:vAlign w:val="center"/>
           </w:tcPr>
@@ -1418,7 +1418,7 @@
         </w:trPr>
         <w:tc>
           <w:tcPr>
-            <w:tcW w:w="2974" w:type="dxa"/>
+            <w:tcW w:w="2549" w:type="dxa"/>
             <w:vAlign w:val="center"/>
           </w:tcPr>
           <w:p>
@@ -1447,6 +1447,37 @@
         </w:tc>
         <w:tc>
           <w:tcPr>
+            <w:tcW w:w="2693" w:type="dxa"/>
+            <w:noWrap/>
+            <w:vAlign w:val="center"/>
+          </w:tcPr>
+          <w:p>
+            <w:pPr>
+              <w:jc w:val="right"/>
+              <w:rPr>
+                <w:rFonts w:ascii="Sylfaen" w:hAnsi="Sylfaen" w:cs="Arial"/>
+                <w:b/>
+                <w:bCs/>
+                <w:color w:val="525252" w:themeColor="accent3" w:themeShade="80"/>
+                <w:sz w:val="18"/>
+                <w:szCs w:val="18"/>
+              </w:rPr>
+            </w:pPr>
+            <w:r>
+              <w:rPr>
+                <w:rFonts w:ascii="Sylfaen" w:hAnsi="Sylfaen" w:cs="Arial"/>
+                <w:b/>
+                <w:bCs/>
+                <w:color w:val="525252" w:themeColor="accent3" w:themeShade="80"/>
+                <w:sz w:val="18"/>
+                <w:szCs w:val="18"/>
+              </w:rPr>
+              <w:t>[Existing Basic]</w:t>
+            </w:r>
+          </w:p>
+        </w:tc>
+        <w:tc>
+          <w:tcPr>
             <w:tcW w:w="2268" w:type="dxa"/>
             <w:noWrap/>
             <w:vAlign w:val="center"/>
@@ -1472,44 +1503,13 @@
                 <w:sz w:val="18"/>
                 <w:szCs w:val="18"/>
               </w:rPr>
-              <w:t>[Existing Basic]</w:t>
+              <w:t>[New Basic]</w:t>
             </w:r>
           </w:p>
         </w:tc>
         <w:tc>
           <w:tcPr>
             <w:tcW w:w="2410" w:type="dxa"/>
-            <w:noWrap/>
-            <w:vAlign w:val="center"/>
-          </w:tcPr>
-          <w:p>
-            <w:pPr>
-              <w:jc w:val="right"/>
-              <w:rPr>
-                <w:rFonts w:ascii="Sylfaen" w:hAnsi="Sylfaen" w:cs="Arial"/>
-                <w:b/>
-                <w:bCs/>
-                <w:color w:val="525252" w:themeColor="accent3" w:themeShade="80"/>
-                <w:sz w:val="18"/>
-                <w:szCs w:val="18"/>
-              </w:rPr>
-            </w:pPr>
-            <w:r>
-              <w:rPr>
-                <w:rFonts w:ascii="Sylfaen" w:hAnsi="Sylfaen" w:cs="Arial"/>
-                <w:b/>
-                <w:bCs/>
-                <w:color w:val="525252" w:themeColor="accent3" w:themeShade="80"/>
-                <w:sz w:val="18"/>
-                <w:szCs w:val="18"/>
-              </w:rPr>
-              <w:t>[New Basic]</w:t>
-            </w:r>
-          </w:p>
-        </w:tc>
-        <w:tc>
-          <w:tcPr>
-            <w:tcW w:w="2044" w:type="dxa"/>
             <w:noWrap/>
             <w:vAlign w:val="center"/>
           </w:tcPr>
@@ -1545,7 +1545,7 @@
         </w:trPr>
         <w:tc>
           <w:tcPr>
-            <w:tcW w:w="2974" w:type="dxa"/>
+            <w:tcW w:w="2549" w:type="dxa"/>
             <w:vAlign w:val="center"/>
           </w:tcPr>
           <w:p>
@@ -1574,6 +1574,37 @@
         </w:tc>
         <w:tc>
           <w:tcPr>
+            <w:tcW w:w="2693" w:type="dxa"/>
+            <w:noWrap/>
+            <w:vAlign w:val="center"/>
+          </w:tcPr>
+          <w:p>
+            <w:pPr>
+              <w:jc w:val="right"/>
+              <w:rPr>
+                <w:rFonts w:ascii="Sylfaen" w:hAnsi="Sylfaen" w:cs="Arial"/>
+                <w:b/>
+                <w:bCs/>
+                <w:color w:val="525252" w:themeColor="accent3" w:themeShade="80"/>
+                <w:sz w:val="18"/>
+                <w:szCs w:val="18"/>
+              </w:rPr>
+            </w:pPr>
+            <w:r>
+              <w:rPr>
+                <w:rFonts w:ascii="Sylfaen" w:hAnsi="Sylfaen" w:cs="Arial"/>
+                <w:b/>
+                <w:bCs/>
+                <w:color w:val="525252" w:themeColor="accent3" w:themeShade="80"/>
+                <w:sz w:val="18"/>
+                <w:szCs w:val="18"/>
+              </w:rPr>
+              <w:t>[Existing HRA]</w:t>
+            </w:r>
+          </w:p>
+        </w:tc>
+        <w:tc>
+          <w:tcPr>
             <w:tcW w:w="2268" w:type="dxa"/>
             <w:noWrap/>
             <w:vAlign w:val="center"/>
@@ -1599,44 +1630,13 @@
                 <w:sz w:val="18"/>
                 <w:szCs w:val="18"/>
               </w:rPr>
-              <w:t>[Existing HRA]</w:t>
+              <w:t>[New HRA]</w:t>
             </w:r>
           </w:p>
         </w:tc>
         <w:tc>
           <w:tcPr>
             <w:tcW w:w="2410" w:type="dxa"/>
-            <w:noWrap/>
-            <w:vAlign w:val="center"/>
-          </w:tcPr>
-          <w:p>
-            <w:pPr>
-              <w:jc w:val="right"/>
-              <w:rPr>
-                <w:rFonts w:ascii="Sylfaen" w:hAnsi="Sylfaen" w:cs="Arial"/>
-                <w:b/>
-                <w:bCs/>
-                <w:color w:val="525252" w:themeColor="accent3" w:themeShade="80"/>
-                <w:sz w:val="18"/>
-                <w:szCs w:val="18"/>
-              </w:rPr>
-            </w:pPr>
-            <w:r>
-              <w:rPr>
-                <w:rFonts w:ascii="Sylfaen" w:hAnsi="Sylfaen" w:cs="Arial"/>
-                <w:b/>
-                <w:bCs/>
-                <w:color w:val="525252" w:themeColor="accent3" w:themeShade="80"/>
-                <w:sz w:val="18"/>
-                <w:szCs w:val="18"/>
-              </w:rPr>
-              <w:t>[New HRA]</w:t>
-            </w:r>
-          </w:p>
-        </w:tc>
-        <w:tc>
-          <w:tcPr>
-            <w:tcW w:w="2044" w:type="dxa"/>
             <w:noWrap/>
             <w:vAlign w:val="center"/>
           </w:tcPr>
@@ -1672,7 +1672,7 @@
         </w:trPr>
         <w:tc>
           <w:tcPr>
-            <w:tcW w:w="2974" w:type="dxa"/>
+            <w:tcW w:w="2549" w:type="dxa"/>
             <w:vAlign w:val="center"/>
           </w:tcPr>
           <w:p>
@@ -1701,6 +1701,37 @@
         </w:tc>
         <w:tc>
           <w:tcPr>
+            <w:tcW w:w="2693" w:type="dxa"/>
+            <w:noWrap/>
+            <w:vAlign w:val="center"/>
+          </w:tcPr>
+          <w:p>
+            <w:pPr>
+              <w:jc w:val="right"/>
+              <w:rPr>
+                <w:rFonts w:ascii="Sylfaen" w:hAnsi="Sylfaen" w:cs="Arial"/>
+                <w:b/>
+                <w:bCs/>
+                <w:color w:val="525252" w:themeColor="accent3" w:themeShade="80"/>
+                <w:sz w:val="18"/>
+                <w:szCs w:val="18"/>
+              </w:rPr>
+            </w:pPr>
+            <w:r>
+              <w:rPr>
+                <w:rFonts w:ascii="Sylfaen" w:eastAsia="Arial" w:hAnsi="Sylfaen" w:cs="Arial"/>
+                <w:b/>
+                <w:bCs/>
+                <w:color w:val="525252" w:themeColor="accent3" w:themeShade="80"/>
+                <w:sz w:val="18"/>
+                <w:szCs w:val="18"/>
+              </w:rPr>
+              <w:t>[Existing Conveyance]</w:t>
+            </w:r>
+          </w:p>
+        </w:tc>
+        <w:tc>
+          <w:tcPr>
             <w:tcW w:w="2268" w:type="dxa"/>
             <w:noWrap/>
             <w:vAlign w:val="center"/>
@@ -1719,51 +1750,20 @@
             </w:pPr>
             <w:r>
               <w:rPr>
-                <w:rFonts w:ascii="Sylfaen" w:eastAsia="Arial" w:hAnsi="Sylfaen" w:cs="Arial"/>
-                <w:b/>
-                <w:bCs/>
-                <w:color w:val="525252" w:themeColor="accent3" w:themeShade="80"/>
-                <w:sz w:val="18"/>
-                <w:szCs w:val="18"/>
-              </w:rPr>
-              <w:t>[Existing Conveyance]</w:t>
+                <w:rFonts w:ascii="Sylfaen" w:hAnsi="Sylfaen" w:cs="Arial"/>
+                <w:b/>
+                <w:bCs/>
+                <w:color w:val="525252" w:themeColor="accent3" w:themeShade="80"/>
+                <w:sz w:val="18"/>
+                <w:szCs w:val="18"/>
+              </w:rPr>
+              <w:t>[New Conveyance]</w:t>
             </w:r>
           </w:p>
         </w:tc>
         <w:tc>
           <w:tcPr>
             <w:tcW w:w="2410" w:type="dxa"/>
-            <w:noWrap/>
-            <w:vAlign w:val="center"/>
-          </w:tcPr>
-          <w:p>
-            <w:pPr>
-              <w:jc w:val="right"/>
-              <w:rPr>
-                <w:rFonts w:ascii="Sylfaen" w:hAnsi="Sylfaen" w:cs="Arial"/>
-                <w:b/>
-                <w:bCs/>
-                <w:color w:val="525252" w:themeColor="accent3" w:themeShade="80"/>
-                <w:sz w:val="18"/>
-                <w:szCs w:val="18"/>
-              </w:rPr>
-            </w:pPr>
-            <w:r>
-              <w:rPr>
-                <w:rFonts w:ascii="Sylfaen" w:hAnsi="Sylfaen" w:cs="Arial"/>
-                <w:b/>
-                <w:bCs/>
-                <w:color w:val="525252" w:themeColor="accent3" w:themeShade="80"/>
-                <w:sz w:val="18"/>
-                <w:szCs w:val="18"/>
-              </w:rPr>
-              <w:t>[New Conveyance]</w:t>
-            </w:r>
-          </w:p>
-        </w:tc>
-        <w:tc>
-          <w:tcPr>
-            <w:tcW w:w="2044" w:type="dxa"/>
             <w:noWrap/>
             <w:vAlign w:val="center"/>
           </w:tcPr>
@@ -1799,7 +1799,7 @@
         </w:trPr>
         <w:tc>
           <w:tcPr>
-            <w:tcW w:w="2974" w:type="dxa"/>
+            <w:tcW w:w="2549" w:type="dxa"/>
             <w:vAlign w:val="center"/>
           </w:tcPr>
           <w:p>
@@ -1828,6 +1828,37 @@
         </w:tc>
         <w:tc>
           <w:tcPr>
+            <w:tcW w:w="2693" w:type="dxa"/>
+            <w:noWrap/>
+            <w:vAlign w:val="center"/>
+          </w:tcPr>
+          <w:p>
+            <w:pPr>
+              <w:jc w:val="right"/>
+              <w:rPr>
+                <w:rFonts w:ascii="Sylfaen" w:hAnsi="Sylfaen" w:cs="Arial"/>
+                <w:b/>
+                <w:bCs/>
+                <w:color w:val="525252" w:themeColor="accent3" w:themeShade="80"/>
+                <w:sz w:val="18"/>
+                <w:szCs w:val="18"/>
+              </w:rPr>
+            </w:pPr>
+            <w:r>
+              <w:rPr>
+                <w:rFonts w:ascii="Sylfaen" w:hAnsi="Sylfaen" w:cs="Arial"/>
+                <w:b/>
+                <w:bCs/>
+                <w:color w:val="525252" w:themeColor="accent3" w:themeShade="80"/>
+                <w:sz w:val="18"/>
+                <w:szCs w:val="18"/>
+              </w:rPr>
+              <w:t>[Existing Special Allowances]</w:t>
+            </w:r>
+          </w:p>
+        </w:tc>
+        <w:tc>
+          <w:tcPr>
             <w:tcW w:w="2268" w:type="dxa"/>
             <w:noWrap/>
             <w:vAlign w:val="center"/>
@@ -1846,51 +1877,20 @@
             </w:pPr>
             <w:r>
               <w:rPr>
-                <w:rFonts w:ascii="Sylfaen" w:hAnsi="Sylfaen" w:cs="Arial"/>
-                <w:b/>
-                <w:bCs/>
-                <w:color w:val="525252" w:themeColor="accent3" w:themeShade="80"/>
-                <w:sz w:val="18"/>
-                <w:szCs w:val="18"/>
-              </w:rPr>
-              <w:t>[Existing Special Allowances]</w:t>
+                <w:rFonts w:ascii="Sylfaen" w:eastAsia="Arial" w:hAnsi="Sylfaen" w:cs="Arial"/>
+                <w:b/>
+                <w:bCs/>
+                <w:color w:val="525252" w:themeColor="accent3" w:themeShade="80"/>
+                <w:sz w:val="18"/>
+                <w:szCs w:val="18"/>
+              </w:rPr>
+              <w:t>[New Special Allowances]</w:t>
             </w:r>
           </w:p>
         </w:tc>
         <w:tc>
           <w:tcPr>
             <w:tcW w:w="2410" w:type="dxa"/>
-            <w:noWrap/>
-            <w:vAlign w:val="center"/>
-          </w:tcPr>
-          <w:p>
-            <w:pPr>
-              <w:jc w:val="right"/>
-              <w:rPr>
-                <w:rFonts w:ascii="Sylfaen" w:hAnsi="Sylfaen" w:cs="Arial"/>
-                <w:b/>
-                <w:bCs/>
-                <w:color w:val="525252" w:themeColor="accent3" w:themeShade="80"/>
-                <w:sz w:val="18"/>
-                <w:szCs w:val="18"/>
-              </w:rPr>
-            </w:pPr>
-            <w:r>
-              <w:rPr>
-                <w:rFonts w:ascii="Sylfaen" w:eastAsia="Arial" w:hAnsi="Sylfaen" w:cs="Arial"/>
-                <w:b/>
-                <w:bCs/>
-                <w:color w:val="525252" w:themeColor="accent3" w:themeShade="80"/>
-                <w:sz w:val="18"/>
-                <w:szCs w:val="18"/>
-              </w:rPr>
-              <w:t>[New Special Allowances]</w:t>
-            </w:r>
-          </w:p>
-        </w:tc>
-        <w:tc>
-          <w:tcPr>
-            <w:tcW w:w="2044" w:type="dxa"/>
             <w:noWrap/>
             <w:vAlign w:val="center"/>
           </w:tcPr>
@@ -1926,7 +1926,7 @@
         </w:trPr>
         <w:tc>
           <w:tcPr>
-            <w:tcW w:w="2974" w:type="dxa"/>
+            <w:tcW w:w="2549" w:type="dxa"/>
             <w:vAlign w:val="center"/>
           </w:tcPr>
           <w:p>
@@ -1955,6 +1955,37 @@
         </w:tc>
         <w:tc>
           <w:tcPr>
+            <w:tcW w:w="2693" w:type="dxa"/>
+            <w:noWrap/>
+            <w:vAlign w:val="center"/>
+          </w:tcPr>
+          <w:p>
+            <w:pPr>
+              <w:jc w:val="right"/>
+              <w:rPr>
+                <w:rFonts w:ascii="Sylfaen" w:hAnsi="Sylfaen" w:cs="Arial"/>
+                <w:b/>
+                <w:bCs/>
+                <w:color w:val="525252" w:themeColor="accent3" w:themeShade="80"/>
+                <w:sz w:val="18"/>
+                <w:szCs w:val="18"/>
+              </w:rPr>
+            </w:pPr>
+            <w:r>
+              <w:rPr>
+                <w:rFonts w:ascii="Sylfaen" w:eastAsia="Arial" w:hAnsi="Sylfaen" w:cs="Arial"/>
+                <w:b/>
+                <w:bCs/>
+                <w:color w:val="525252" w:themeColor="accent3" w:themeShade="80"/>
+                <w:sz w:val="18"/>
+                <w:szCs w:val="18"/>
+              </w:rPr>
+              <w:t>[Existing Medical Allowance]</w:t>
+            </w:r>
+          </w:p>
+        </w:tc>
+        <w:tc>
+          <w:tcPr>
             <w:tcW w:w="2268" w:type="dxa"/>
             <w:noWrap/>
             <w:vAlign w:val="center"/>
@@ -1980,44 +2011,13 @@
                 <w:sz w:val="18"/>
                 <w:szCs w:val="18"/>
               </w:rPr>
-              <w:t>[Existing Medical Allowance]</w:t>
+              <w:t>[New Medical Allowance]</w:t>
             </w:r>
           </w:p>
         </w:tc>
         <w:tc>
           <w:tcPr>
             <w:tcW w:w="2410" w:type="dxa"/>
-            <w:noWrap/>
-            <w:vAlign w:val="center"/>
-          </w:tcPr>
-          <w:p>
-            <w:pPr>
-              <w:jc w:val="right"/>
-              <w:rPr>
-                <w:rFonts w:ascii="Sylfaen" w:hAnsi="Sylfaen" w:cs="Arial"/>
-                <w:b/>
-                <w:bCs/>
-                <w:color w:val="525252" w:themeColor="accent3" w:themeShade="80"/>
-                <w:sz w:val="18"/>
-                <w:szCs w:val="18"/>
-              </w:rPr>
-            </w:pPr>
-            <w:r>
-              <w:rPr>
-                <w:rFonts w:ascii="Sylfaen" w:eastAsia="Arial" w:hAnsi="Sylfaen" w:cs="Arial"/>
-                <w:b/>
-                <w:bCs/>
-                <w:color w:val="525252" w:themeColor="accent3" w:themeShade="80"/>
-                <w:sz w:val="18"/>
-                <w:szCs w:val="18"/>
-              </w:rPr>
-              <w:t>[New Medical Allowance]</w:t>
-            </w:r>
-          </w:p>
-        </w:tc>
-        <w:tc>
-          <w:tcPr>
-            <w:tcW w:w="2044" w:type="dxa"/>
             <w:noWrap/>
             <w:vAlign w:val="center"/>
           </w:tcPr>
@@ -2053,7 +2053,7 @@
         </w:trPr>
         <w:tc>
           <w:tcPr>
-            <w:tcW w:w="2974" w:type="dxa"/>
+            <w:tcW w:w="2549" w:type="dxa"/>
             <w:vAlign w:val="center"/>
           </w:tcPr>
           <w:p>
@@ -2082,6 +2082,37 @@
         </w:tc>
         <w:tc>
           <w:tcPr>
+            <w:tcW w:w="2693" w:type="dxa"/>
+            <w:noWrap/>
+            <w:vAlign w:val="center"/>
+          </w:tcPr>
+          <w:p>
+            <w:pPr>
+              <w:jc w:val="right"/>
+              <w:rPr>
+                <w:rFonts w:ascii="Sylfaen" w:eastAsia="Arial" w:hAnsi="Sylfaen" w:cs="Arial"/>
+                <w:b/>
+                <w:bCs/>
+                <w:color w:val="525252" w:themeColor="accent3" w:themeShade="80"/>
+                <w:sz w:val="18"/>
+                <w:szCs w:val="18"/>
+              </w:rPr>
+            </w:pPr>
+            <w:r>
+              <w:rPr>
+                <w:rFonts w:ascii="Sylfaen" w:eastAsia="Arial" w:hAnsi="Sylfaen" w:cs="Arial"/>
+                <w:b/>
+                <w:bCs/>
+                <w:color w:val="525252" w:themeColor="accent3" w:themeShade="80"/>
+                <w:sz w:val="18"/>
+                <w:szCs w:val="18"/>
+              </w:rPr>
+              <w:t>[Existing Bonus]</w:t>
+            </w:r>
+          </w:p>
+        </w:tc>
+        <w:tc>
+          <w:tcPr>
             <w:tcW w:w="2268" w:type="dxa"/>
             <w:noWrap/>
             <w:vAlign w:val="center"/>
@@ -2107,44 +2138,13 @@
                 <w:sz w:val="18"/>
                 <w:szCs w:val="18"/>
               </w:rPr>
-              <w:t>[Existing Bonus]</w:t>
+              <w:t>[New Bonus]</w:t>
             </w:r>
           </w:p>
         </w:tc>
         <w:tc>
           <w:tcPr>
             <w:tcW w:w="2410" w:type="dxa"/>
-            <w:noWrap/>
-            <w:vAlign w:val="center"/>
-          </w:tcPr>
-          <w:p>
-            <w:pPr>
-              <w:jc w:val="right"/>
-              <w:rPr>
-                <w:rFonts w:ascii="Sylfaen" w:eastAsia="Arial" w:hAnsi="Sylfaen" w:cs="Arial"/>
-                <w:b/>
-                <w:bCs/>
-                <w:color w:val="525252" w:themeColor="accent3" w:themeShade="80"/>
-                <w:sz w:val="18"/>
-                <w:szCs w:val="18"/>
-              </w:rPr>
-            </w:pPr>
-            <w:r>
-              <w:rPr>
-                <w:rFonts w:ascii="Sylfaen" w:eastAsia="Arial" w:hAnsi="Sylfaen" w:cs="Arial"/>
-                <w:b/>
-                <w:bCs/>
-                <w:color w:val="525252" w:themeColor="accent3" w:themeShade="80"/>
-                <w:sz w:val="18"/>
-                <w:szCs w:val="18"/>
-              </w:rPr>
-              <w:t>[New Bonus]</w:t>
-            </w:r>
-          </w:p>
-        </w:tc>
-        <w:tc>
-          <w:tcPr>
-            <w:tcW w:w="2044" w:type="dxa"/>
             <w:noWrap/>
             <w:vAlign w:val="center"/>
           </w:tcPr>
@@ -2180,7 +2180,7 @@
         </w:trPr>
         <w:tc>
           <w:tcPr>
-            <w:tcW w:w="2974" w:type="dxa"/>
+            <w:tcW w:w="2549" w:type="dxa"/>
             <w:shd w:val="clear" w:color="auto" w:fill="D5DCE4" w:themeFill="text2" w:themeFillTint="33"/>
             <w:vAlign w:val="center"/>
           </w:tcPr>
@@ -2199,6 +2199,30 @@
                 <w:color w:val="2C2C2C"/>
               </w:rPr>
               <w:t>Total Gross</w:t>
+            </w:r>
+          </w:p>
+        </w:tc>
+        <w:tc>
+          <w:tcPr>
+            <w:tcW w:w="2693" w:type="dxa"/>
+            <w:shd w:val="clear" w:color="auto" w:fill="D5DCE4" w:themeFill="text2" w:themeFillTint="33"/>
+            <w:noWrap/>
+            <w:vAlign w:val="center"/>
+          </w:tcPr>
+          <w:p>
+            <w:pPr>
+              <w:jc w:val="right"/>
+              <w:rPr>
+                <w:rFonts w:ascii="Sylfaen" w:eastAsia="Arial" w:hAnsi="Sylfaen" w:cs="Arial"/>
+                <w:color w:val="2C2C2C"/>
+              </w:rPr>
+            </w:pPr>
+            <w:r>
+              <w:rPr>
+                <w:rFonts w:ascii="Sylfaen" w:eastAsia="Arial" w:hAnsi="Sylfaen" w:cs="Arial"/>
+                <w:color w:val="2C2C2C"/>
+              </w:rPr>
+              <w:t>[Existing Total Gross]</w:t>
             </w:r>
           </w:p>
         </w:tc>
@@ -2222,37 +2246,13 @@
                 <w:rFonts w:ascii="Sylfaen" w:eastAsia="Arial" w:hAnsi="Sylfaen" w:cs="Arial"/>
                 <w:color w:val="2C2C2C"/>
               </w:rPr>
-              <w:t>[Existing Total Gross]</w:t>
+              <w:t>[New Total Gross]</w:t>
             </w:r>
           </w:p>
         </w:tc>
         <w:tc>
           <w:tcPr>
             <w:tcW w:w="2410" w:type="dxa"/>
-            <w:shd w:val="clear" w:color="auto" w:fill="D5DCE4" w:themeFill="text2" w:themeFillTint="33"/>
-            <w:noWrap/>
-            <w:vAlign w:val="center"/>
-          </w:tcPr>
-          <w:p>
-            <w:pPr>
-              <w:jc w:val="right"/>
-              <w:rPr>
-                <w:rFonts w:ascii="Sylfaen" w:eastAsia="Arial" w:hAnsi="Sylfaen" w:cs="Arial"/>
-                <w:color w:val="2C2C2C"/>
-              </w:rPr>
-            </w:pPr>
-            <w:r>
-              <w:rPr>
-                <w:rFonts w:ascii="Sylfaen" w:eastAsia="Arial" w:hAnsi="Sylfaen" w:cs="Arial"/>
-                <w:color w:val="2C2C2C"/>
-              </w:rPr>
-              <w:t>[New Total Gross]</w:t>
-            </w:r>
-          </w:p>
-        </w:tc>
-        <w:tc>
-          <w:tcPr>
-            <w:tcW w:w="2044" w:type="dxa"/>
             <w:shd w:val="clear" w:color="auto" w:fill="D5DCE4" w:themeFill="text2" w:themeFillTint="33"/>
             <w:noWrap/>
             <w:vAlign w:val="center"/>
@@ -2281,7 +2281,7 @@
         </w:trPr>
         <w:tc>
           <w:tcPr>
-            <w:tcW w:w="2974" w:type="dxa"/>
+            <w:tcW w:w="2549" w:type="dxa"/>
             <w:vAlign w:val="center"/>
           </w:tcPr>
           <w:p>
@@ -2310,6 +2310,37 @@
         </w:tc>
         <w:tc>
           <w:tcPr>
+            <w:tcW w:w="2693" w:type="dxa"/>
+            <w:noWrap/>
+            <w:vAlign w:val="center"/>
+          </w:tcPr>
+          <w:p>
+            <w:pPr>
+              <w:jc w:val="right"/>
+              <w:rPr>
+                <w:rFonts w:ascii="Sylfaen" w:eastAsia="Arial" w:hAnsi="Sylfaen" w:cs="Arial"/>
+                <w:b/>
+                <w:bCs/>
+                <w:color w:val="525252" w:themeColor="accent3" w:themeShade="80"/>
+                <w:sz w:val="18"/>
+                <w:szCs w:val="18"/>
+              </w:rPr>
+            </w:pPr>
+            <w:r>
+              <w:rPr>
+                <w:rFonts w:ascii="Sylfaen" w:eastAsia="Arial" w:hAnsi="Sylfaen" w:cs="Arial"/>
+                <w:b/>
+                <w:bCs/>
+                <w:color w:val="525252" w:themeColor="accent3" w:themeShade="80"/>
+                <w:sz w:val="18"/>
+                <w:szCs w:val="18"/>
+              </w:rPr>
+              <w:t>[Existing Employee PF]</w:t>
+            </w:r>
+          </w:p>
+        </w:tc>
+        <w:tc>
+          <w:tcPr>
             <w:tcW w:w="2268" w:type="dxa"/>
             <w:noWrap/>
             <w:vAlign w:val="center"/>
@@ -2335,44 +2366,13 @@
                 <w:sz w:val="18"/>
                 <w:szCs w:val="18"/>
               </w:rPr>
-              <w:t>[Existing Employee PF]</w:t>
+              <w:t>[New Employee PF]</w:t>
             </w:r>
           </w:p>
         </w:tc>
         <w:tc>
           <w:tcPr>
             <w:tcW w:w="2410" w:type="dxa"/>
-            <w:noWrap/>
-            <w:vAlign w:val="center"/>
-          </w:tcPr>
-          <w:p>
-            <w:pPr>
-              <w:jc w:val="right"/>
-              <w:rPr>
-                <w:rFonts w:ascii="Sylfaen" w:eastAsia="Arial" w:hAnsi="Sylfaen" w:cs="Arial"/>
-                <w:b/>
-                <w:bCs/>
-                <w:color w:val="525252" w:themeColor="accent3" w:themeShade="80"/>
-                <w:sz w:val="18"/>
-                <w:szCs w:val="18"/>
-              </w:rPr>
-            </w:pPr>
-            <w:r>
-              <w:rPr>
-                <w:rFonts w:ascii="Sylfaen" w:eastAsia="Arial" w:hAnsi="Sylfaen" w:cs="Arial"/>
-                <w:b/>
-                <w:bCs/>
-                <w:color w:val="525252" w:themeColor="accent3" w:themeShade="80"/>
-                <w:sz w:val="18"/>
-                <w:szCs w:val="18"/>
-              </w:rPr>
-              <w:t>[New Employee PF]</w:t>
-            </w:r>
-          </w:p>
-        </w:tc>
-        <w:tc>
-          <w:tcPr>
-            <w:tcW w:w="2044" w:type="dxa"/>
             <w:noWrap/>
             <w:vAlign w:val="center"/>
           </w:tcPr>
@@ -2408,7 +2408,7 @@
         </w:trPr>
         <w:tc>
           <w:tcPr>
-            <w:tcW w:w="2974" w:type="dxa"/>
+            <w:tcW w:w="2549" w:type="dxa"/>
             <w:vAlign w:val="center"/>
           </w:tcPr>
           <w:p>
@@ -2437,6 +2437,37 @@
         </w:tc>
         <w:tc>
           <w:tcPr>
+            <w:tcW w:w="2693" w:type="dxa"/>
+            <w:noWrap/>
+            <w:vAlign w:val="center"/>
+          </w:tcPr>
+          <w:p>
+            <w:pPr>
+              <w:jc w:val="right"/>
+              <w:rPr>
+                <w:rFonts w:ascii="Sylfaen" w:eastAsia="Arial" w:hAnsi="Sylfaen" w:cs="Arial"/>
+                <w:b/>
+                <w:bCs/>
+                <w:color w:val="525252" w:themeColor="accent3" w:themeShade="80"/>
+                <w:sz w:val="18"/>
+                <w:szCs w:val="18"/>
+              </w:rPr>
+            </w:pPr>
+            <w:r>
+              <w:rPr>
+                <w:rFonts w:ascii="Sylfaen" w:eastAsia="Arial" w:hAnsi="Sylfaen" w:cs="Arial"/>
+                <w:b/>
+                <w:bCs/>
+                <w:color w:val="525252" w:themeColor="accent3" w:themeShade="80"/>
+                <w:sz w:val="18"/>
+                <w:szCs w:val="18"/>
+              </w:rPr>
+              <w:t>[Existing Employee ESIC]</w:t>
+            </w:r>
+          </w:p>
+        </w:tc>
+        <w:tc>
+          <w:tcPr>
             <w:tcW w:w="2268" w:type="dxa"/>
             <w:noWrap/>
             <w:vAlign w:val="center"/>
@@ -2462,44 +2493,13 @@
                 <w:sz w:val="18"/>
                 <w:szCs w:val="18"/>
               </w:rPr>
-              <w:t>[Existing Employee ESIC]</w:t>
+              <w:t>[New Employee ESIC]</w:t>
             </w:r>
           </w:p>
         </w:tc>
         <w:tc>
           <w:tcPr>
             <w:tcW w:w="2410" w:type="dxa"/>
-            <w:noWrap/>
-            <w:vAlign w:val="center"/>
-          </w:tcPr>
-          <w:p>
-            <w:pPr>
-              <w:jc w:val="right"/>
-              <w:rPr>
-                <w:rFonts w:ascii="Sylfaen" w:eastAsia="Arial" w:hAnsi="Sylfaen" w:cs="Arial"/>
-                <w:b/>
-                <w:bCs/>
-                <w:color w:val="525252" w:themeColor="accent3" w:themeShade="80"/>
-                <w:sz w:val="18"/>
-                <w:szCs w:val="18"/>
-              </w:rPr>
-            </w:pPr>
-            <w:r>
-              <w:rPr>
-                <w:rFonts w:ascii="Sylfaen" w:eastAsia="Arial" w:hAnsi="Sylfaen" w:cs="Arial"/>
-                <w:b/>
-                <w:bCs/>
-                <w:color w:val="525252" w:themeColor="accent3" w:themeShade="80"/>
-                <w:sz w:val="18"/>
-                <w:szCs w:val="18"/>
-              </w:rPr>
-              <w:t>[New Employee ESIC]</w:t>
-            </w:r>
-          </w:p>
-        </w:tc>
-        <w:tc>
-          <w:tcPr>
-            <w:tcW w:w="2044" w:type="dxa"/>
             <w:noWrap/>
             <w:vAlign w:val="center"/>
           </w:tcPr>
@@ -2535,7 +2535,7 @@
         </w:trPr>
         <w:tc>
           <w:tcPr>
-            <w:tcW w:w="2974" w:type="dxa"/>
+            <w:tcW w:w="2549" w:type="dxa"/>
             <w:vAlign w:val="center"/>
           </w:tcPr>
           <w:p>
@@ -2564,6 +2564,37 @@
         </w:tc>
         <w:tc>
           <w:tcPr>
+            <w:tcW w:w="2693" w:type="dxa"/>
+            <w:noWrap/>
+            <w:vAlign w:val="center"/>
+          </w:tcPr>
+          <w:p>
+            <w:pPr>
+              <w:jc w:val="right"/>
+              <w:rPr>
+                <w:rFonts w:ascii="Sylfaen" w:eastAsia="Arial" w:hAnsi="Sylfaen" w:cs="Arial"/>
+                <w:b/>
+                <w:bCs/>
+                <w:color w:val="525252" w:themeColor="accent3" w:themeShade="80"/>
+                <w:sz w:val="18"/>
+                <w:szCs w:val="18"/>
+              </w:rPr>
+            </w:pPr>
+            <w:r>
+              <w:rPr>
+                <w:rFonts w:ascii="Sylfaen" w:eastAsia="Arial" w:hAnsi="Sylfaen" w:cs="Arial"/>
+                <w:b/>
+                <w:bCs/>
+                <w:color w:val="525252" w:themeColor="accent3" w:themeShade="80"/>
+                <w:sz w:val="18"/>
+                <w:szCs w:val="18"/>
+              </w:rPr>
+              <w:t>[Existing Employee LWF]</w:t>
+            </w:r>
+          </w:p>
+        </w:tc>
+        <w:tc>
+          <w:tcPr>
             <w:tcW w:w="2268" w:type="dxa"/>
             <w:noWrap/>
             <w:vAlign w:val="center"/>
@@ -2589,44 +2620,13 @@
                 <w:sz w:val="18"/>
                 <w:szCs w:val="18"/>
               </w:rPr>
-              <w:t>[Existing Employee LWF]</w:t>
+              <w:t>[New Employee LWF]</w:t>
             </w:r>
           </w:p>
         </w:tc>
         <w:tc>
           <w:tcPr>
             <w:tcW w:w="2410" w:type="dxa"/>
-            <w:noWrap/>
-            <w:vAlign w:val="center"/>
-          </w:tcPr>
-          <w:p>
-            <w:pPr>
-              <w:jc w:val="right"/>
-              <w:rPr>
-                <w:rFonts w:ascii="Sylfaen" w:eastAsia="Arial" w:hAnsi="Sylfaen" w:cs="Arial"/>
-                <w:b/>
-                <w:bCs/>
-                <w:color w:val="525252" w:themeColor="accent3" w:themeShade="80"/>
-                <w:sz w:val="18"/>
-                <w:szCs w:val="18"/>
-              </w:rPr>
-            </w:pPr>
-            <w:r>
-              <w:rPr>
-                <w:rFonts w:ascii="Sylfaen" w:eastAsia="Arial" w:hAnsi="Sylfaen" w:cs="Arial"/>
-                <w:b/>
-                <w:bCs/>
-                <w:color w:val="525252" w:themeColor="accent3" w:themeShade="80"/>
-                <w:sz w:val="18"/>
-                <w:szCs w:val="18"/>
-              </w:rPr>
-              <w:t>[New Employee LWF]</w:t>
-            </w:r>
-          </w:p>
-        </w:tc>
-        <w:tc>
-          <w:tcPr>
-            <w:tcW w:w="2044" w:type="dxa"/>
             <w:noWrap/>
             <w:vAlign w:val="center"/>
           </w:tcPr>
@@ -2662,7 +2662,7 @@
         </w:trPr>
         <w:tc>
           <w:tcPr>
-            <w:tcW w:w="2974" w:type="dxa"/>
+            <w:tcW w:w="2549" w:type="dxa"/>
             <w:shd w:val="clear" w:color="auto" w:fill="D5DCE4" w:themeFill="text2" w:themeFillTint="33"/>
             <w:vAlign w:val="center"/>
           </w:tcPr>
@@ -2681,6 +2681,30 @@
                 <w:color w:val="2C2C2C"/>
               </w:rPr>
               <w:t>Take Home</w:t>
+            </w:r>
+          </w:p>
+        </w:tc>
+        <w:tc>
+          <w:tcPr>
+            <w:tcW w:w="2693" w:type="dxa"/>
+            <w:shd w:val="clear" w:color="auto" w:fill="D5DCE4" w:themeFill="text2" w:themeFillTint="33"/>
+            <w:noWrap/>
+            <w:vAlign w:val="center"/>
+          </w:tcPr>
+          <w:p>
+            <w:pPr>
+              <w:jc w:val="right"/>
+              <w:rPr>
+                <w:rFonts w:ascii="Sylfaen" w:eastAsia="Arial" w:hAnsi="Sylfaen" w:cs="Arial"/>
+                <w:color w:val="2C2C2C"/>
+              </w:rPr>
+            </w:pPr>
+            <w:r>
+              <w:rPr>
+                <w:rFonts w:ascii="Sylfaen" w:eastAsia="Arial" w:hAnsi="Sylfaen" w:cs="Arial"/>
+                <w:color w:val="2C2C2C"/>
+              </w:rPr>
+              <w:t>[Existing Take Home]</w:t>
             </w:r>
           </w:p>
         </w:tc>
@@ -2704,37 +2728,13 @@
                 <w:rFonts w:ascii="Sylfaen" w:eastAsia="Arial" w:hAnsi="Sylfaen" w:cs="Arial"/>
                 <w:color w:val="2C2C2C"/>
               </w:rPr>
-              <w:t>[Existing Take Home]</w:t>
+              <w:t>[New Take Home]</w:t>
             </w:r>
           </w:p>
         </w:tc>
         <w:tc>
           <w:tcPr>
             <w:tcW w:w="2410" w:type="dxa"/>
-            <w:shd w:val="clear" w:color="auto" w:fill="D5DCE4" w:themeFill="text2" w:themeFillTint="33"/>
-            <w:noWrap/>
-            <w:vAlign w:val="center"/>
-          </w:tcPr>
-          <w:p>
-            <w:pPr>
-              <w:jc w:val="right"/>
-              <w:rPr>
-                <w:rFonts w:ascii="Sylfaen" w:eastAsia="Arial" w:hAnsi="Sylfaen" w:cs="Arial"/>
-                <w:color w:val="2C2C2C"/>
-              </w:rPr>
-            </w:pPr>
-            <w:r>
-              <w:rPr>
-                <w:rFonts w:ascii="Sylfaen" w:eastAsia="Arial" w:hAnsi="Sylfaen" w:cs="Arial"/>
-                <w:color w:val="2C2C2C"/>
-              </w:rPr>
-              <w:t>[New Take Home]</w:t>
-            </w:r>
-          </w:p>
-        </w:tc>
-        <w:tc>
-          <w:tcPr>
-            <w:tcW w:w="2044" w:type="dxa"/>
             <w:shd w:val="clear" w:color="auto" w:fill="D5DCE4" w:themeFill="text2" w:themeFillTint="33"/>
             <w:noWrap/>
             <w:vAlign w:val="center"/>
@@ -2763,7 +2763,7 @@
         </w:trPr>
         <w:tc>
           <w:tcPr>
-            <w:tcW w:w="2974" w:type="dxa"/>
+            <w:tcW w:w="2549" w:type="dxa"/>
             <w:vAlign w:val="center"/>
           </w:tcPr>
           <w:p>
@@ -2792,6 +2792,37 @@
         </w:tc>
         <w:tc>
           <w:tcPr>
+            <w:tcW w:w="2693" w:type="dxa"/>
+            <w:noWrap/>
+            <w:vAlign w:val="center"/>
+          </w:tcPr>
+          <w:p>
+            <w:pPr>
+              <w:jc w:val="right"/>
+              <w:rPr>
+                <w:rFonts w:ascii="Sylfaen" w:eastAsia="Arial" w:hAnsi="Sylfaen" w:cs="Arial"/>
+                <w:b/>
+                <w:bCs/>
+                <w:color w:val="525252" w:themeColor="accent3" w:themeShade="80"/>
+                <w:sz w:val="18"/>
+                <w:szCs w:val="18"/>
+              </w:rPr>
+            </w:pPr>
+            <w:r>
+              <w:rPr>
+                <w:rFonts w:ascii="Sylfaen" w:eastAsia="Arial" w:hAnsi="Sylfaen" w:cs="Arial"/>
+                <w:b/>
+                <w:bCs/>
+                <w:color w:val="525252" w:themeColor="accent3" w:themeShade="80"/>
+                <w:sz w:val="18"/>
+                <w:szCs w:val="18"/>
+              </w:rPr>
+              <w:t>[Existing Company PF]</w:t>
+            </w:r>
+          </w:p>
+        </w:tc>
+        <w:tc>
+          <w:tcPr>
             <w:tcW w:w="2268" w:type="dxa"/>
             <w:noWrap/>
             <w:vAlign w:val="center"/>
@@ -2817,44 +2848,13 @@
                 <w:sz w:val="18"/>
                 <w:szCs w:val="18"/>
               </w:rPr>
-              <w:t>[Existing Company PF]</w:t>
+              <w:t>[New Company PF]</w:t>
             </w:r>
           </w:p>
         </w:tc>
         <w:tc>
           <w:tcPr>
             <w:tcW w:w="2410" w:type="dxa"/>
-            <w:noWrap/>
-            <w:vAlign w:val="center"/>
-          </w:tcPr>
-          <w:p>
-            <w:pPr>
-              <w:jc w:val="right"/>
-              <w:rPr>
-                <w:rFonts w:ascii="Sylfaen" w:eastAsia="Arial" w:hAnsi="Sylfaen" w:cs="Arial"/>
-                <w:b/>
-                <w:bCs/>
-                <w:color w:val="525252" w:themeColor="accent3" w:themeShade="80"/>
-                <w:sz w:val="18"/>
-                <w:szCs w:val="18"/>
-              </w:rPr>
-            </w:pPr>
-            <w:r>
-              <w:rPr>
-                <w:rFonts w:ascii="Sylfaen" w:eastAsia="Arial" w:hAnsi="Sylfaen" w:cs="Arial"/>
-                <w:b/>
-                <w:bCs/>
-                <w:color w:val="525252" w:themeColor="accent3" w:themeShade="80"/>
-                <w:sz w:val="18"/>
-                <w:szCs w:val="18"/>
-              </w:rPr>
-              <w:t>[New Company PF]</w:t>
-            </w:r>
-          </w:p>
-        </w:tc>
-        <w:tc>
-          <w:tcPr>
-            <w:tcW w:w="2044" w:type="dxa"/>
             <w:noWrap/>
             <w:vAlign w:val="center"/>
           </w:tcPr>
@@ -2890,7 +2890,7 @@
         </w:trPr>
         <w:tc>
           <w:tcPr>
-            <w:tcW w:w="2974" w:type="dxa"/>
+            <w:tcW w:w="2549" w:type="dxa"/>
             <w:vAlign w:val="center"/>
           </w:tcPr>
           <w:p>
@@ -2919,6 +2919,37 @@
         </w:tc>
         <w:tc>
           <w:tcPr>
+            <w:tcW w:w="2693" w:type="dxa"/>
+            <w:noWrap/>
+            <w:vAlign w:val="center"/>
+          </w:tcPr>
+          <w:p>
+            <w:pPr>
+              <w:jc w:val="right"/>
+              <w:rPr>
+                <w:rFonts w:ascii="Sylfaen" w:eastAsia="Arial" w:hAnsi="Sylfaen" w:cs="Arial"/>
+                <w:b/>
+                <w:bCs/>
+                <w:color w:val="525252" w:themeColor="accent3" w:themeShade="80"/>
+                <w:sz w:val="18"/>
+                <w:szCs w:val="18"/>
+              </w:rPr>
+            </w:pPr>
+            <w:r>
+              <w:rPr>
+                <w:rFonts w:ascii="Sylfaen" w:eastAsia="Arial" w:hAnsi="Sylfaen" w:cs="Arial"/>
+                <w:b/>
+                <w:bCs/>
+                <w:color w:val="525252" w:themeColor="accent3" w:themeShade="80"/>
+                <w:sz w:val="18"/>
+                <w:szCs w:val="18"/>
+              </w:rPr>
+              <w:t>[Existing Company ESIC]</w:t>
+            </w:r>
+          </w:p>
+        </w:tc>
+        <w:tc>
+          <w:tcPr>
             <w:tcW w:w="2268" w:type="dxa"/>
             <w:noWrap/>
             <w:vAlign w:val="center"/>
@@ -2944,44 +2975,13 @@
                 <w:sz w:val="18"/>
                 <w:szCs w:val="18"/>
               </w:rPr>
-              <w:t>[Existing Company ESIC]</w:t>
+              <w:t>[New Company ESIC]</w:t>
             </w:r>
           </w:p>
         </w:tc>
         <w:tc>
           <w:tcPr>
             <w:tcW w:w="2410" w:type="dxa"/>
-            <w:noWrap/>
-            <w:vAlign w:val="center"/>
-          </w:tcPr>
-          <w:p>
-            <w:pPr>
-              <w:jc w:val="right"/>
-              <w:rPr>
-                <w:rFonts w:ascii="Sylfaen" w:eastAsia="Arial" w:hAnsi="Sylfaen" w:cs="Arial"/>
-                <w:b/>
-                <w:bCs/>
-                <w:color w:val="525252" w:themeColor="accent3" w:themeShade="80"/>
-                <w:sz w:val="18"/>
-                <w:szCs w:val="18"/>
-              </w:rPr>
-            </w:pPr>
-            <w:r>
-              <w:rPr>
-                <w:rFonts w:ascii="Sylfaen" w:eastAsia="Arial" w:hAnsi="Sylfaen" w:cs="Arial"/>
-                <w:b/>
-                <w:bCs/>
-                <w:color w:val="525252" w:themeColor="accent3" w:themeShade="80"/>
-                <w:sz w:val="18"/>
-                <w:szCs w:val="18"/>
-              </w:rPr>
-              <w:t>[New Company ESIC]</w:t>
-            </w:r>
-          </w:p>
-        </w:tc>
-        <w:tc>
-          <w:tcPr>
-            <w:tcW w:w="2044" w:type="dxa"/>
             <w:noWrap/>
             <w:vAlign w:val="center"/>
           </w:tcPr>
@@ -3017,7 +3017,7 @@
         </w:trPr>
         <w:tc>
           <w:tcPr>
-            <w:tcW w:w="2974" w:type="dxa"/>
+            <w:tcW w:w="2549" w:type="dxa"/>
             <w:vAlign w:val="center"/>
           </w:tcPr>
           <w:p>
@@ -3046,6 +3046,37 @@
         </w:tc>
         <w:tc>
           <w:tcPr>
+            <w:tcW w:w="2693" w:type="dxa"/>
+            <w:noWrap/>
+            <w:vAlign w:val="center"/>
+          </w:tcPr>
+          <w:p>
+            <w:pPr>
+              <w:jc w:val="right"/>
+              <w:rPr>
+                <w:rFonts w:ascii="Sylfaen" w:eastAsia="Arial" w:hAnsi="Sylfaen" w:cs="Arial"/>
+                <w:b/>
+                <w:bCs/>
+                <w:color w:val="525252" w:themeColor="accent3" w:themeShade="80"/>
+                <w:sz w:val="18"/>
+                <w:szCs w:val="18"/>
+              </w:rPr>
+            </w:pPr>
+            <w:r>
+              <w:rPr>
+                <w:rFonts w:ascii="Sylfaen" w:eastAsia="Arial" w:hAnsi="Sylfaen" w:cs="Arial"/>
+                <w:b/>
+                <w:bCs/>
+                <w:color w:val="525252" w:themeColor="accent3" w:themeShade="80"/>
+                <w:sz w:val="18"/>
+                <w:szCs w:val="18"/>
+              </w:rPr>
+              <w:t>[Existing Company LWF]</w:t>
+            </w:r>
+          </w:p>
+        </w:tc>
+        <w:tc>
+          <w:tcPr>
             <w:tcW w:w="2268" w:type="dxa"/>
             <w:noWrap/>
             <w:vAlign w:val="center"/>
@@ -3071,44 +3102,13 @@
                 <w:sz w:val="18"/>
                 <w:szCs w:val="18"/>
               </w:rPr>
-              <w:t>[Existing Company LWF]</w:t>
+              <w:t>[New Company LWF]</w:t>
             </w:r>
           </w:p>
         </w:tc>
         <w:tc>
           <w:tcPr>
             <w:tcW w:w="2410" w:type="dxa"/>
-            <w:noWrap/>
-            <w:vAlign w:val="center"/>
-          </w:tcPr>
-          <w:p>
-            <w:pPr>
-              <w:jc w:val="right"/>
-              <w:rPr>
-                <w:rFonts w:ascii="Sylfaen" w:eastAsia="Arial" w:hAnsi="Sylfaen" w:cs="Arial"/>
-                <w:b/>
-                <w:bCs/>
-                <w:color w:val="525252" w:themeColor="accent3" w:themeShade="80"/>
-                <w:sz w:val="18"/>
-                <w:szCs w:val="18"/>
-              </w:rPr>
-            </w:pPr>
-            <w:r>
-              <w:rPr>
-                <w:rFonts w:ascii="Sylfaen" w:eastAsia="Arial" w:hAnsi="Sylfaen" w:cs="Arial"/>
-                <w:b/>
-                <w:bCs/>
-                <w:color w:val="525252" w:themeColor="accent3" w:themeShade="80"/>
-                <w:sz w:val="18"/>
-                <w:szCs w:val="18"/>
-              </w:rPr>
-              <w:t>[New Company LWF]</w:t>
-            </w:r>
-          </w:p>
-        </w:tc>
-        <w:tc>
-          <w:tcPr>
-            <w:tcW w:w="2044" w:type="dxa"/>
             <w:noWrap/>
             <w:vAlign w:val="center"/>
           </w:tcPr>
@@ -3144,7 +3144,7 @@
         </w:trPr>
         <w:tc>
           <w:tcPr>
-            <w:tcW w:w="2974" w:type="dxa"/>
+            <w:tcW w:w="2549" w:type="dxa"/>
             <w:shd w:val="clear" w:color="auto" w:fill="1F3864" w:themeFill="accent1" w:themeFillShade="80"/>
             <w:vAlign w:val="center"/>
           </w:tcPr>
@@ -3172,7 +3172,7 @@
         </w:tc>
         <w:tc>
           <w:tcPr>
-            <w:tcW w:w="2268" w:type="dxa"/>
+            <w:tcW w:w="2693" w:type="dxa"/>
             <w:shd w:val="clear" w:color="auto" w:fill="1F3864" w:themeFill="accent1" w:themeFillShade="80"/>
             <w:noWrap/>
             <w:vAlign w:val="center"/>
@@ -3200,7 +3200,7 @@
         </w:tc>
         <w:tc>
           <w:tcPr>
-            <w:tcW w:w="2410" w:type="dxa"/>
+            <w:tcW w:w="2268" w:type="dxa"/>
             <w:shd w:val="clear" w:color="auto" w:fill="1F3864" w:themeFill="accent1" w:themeFillShade="80"/>
             <w:noWrap/>
             <w:vAlign w:val="center"/>
@@ -3228,7 +3228,7 @@
         </w:tc>
         <w:tc>
           <w:tcPr>
-            <w:tcW w:w="2044" w:type="dxa"/>
+            <w:tcW w:w="2410" w:type="dxa"/>
             <w:shd w:val="clear" w:color="auto" w:fill="1F3864" w:themeFill="accent1" w:themeFillShade="80"/>
             <w:noWrap/>
             <w:vAlign w:val="center"/>
@@ -3317,6 +3317,7 @@
     </w:p>
     <w:p>
       <w:pPr>
+        <w:spacing w:after="240"/>
         <w:rPr>
           <w:rFonts w:ascii="Sylfaen" w:eastAsia="Arial" w:hAnsi="Sylfaen" w:cs="Arial"/>
           <w:color w:val="2C2C2C"/>

</xml_diff>

<commit_message>
Shift signature and sign-off block down one line, away from the table
Your screenshot showed the table's bottom border sitting right against
the signature with almost no breathing room. Moved the whole cluster
(signature + "Best Regards," / "Chief Financial Officer" / "Little Nap
Designs Pvt. Ltd.") down together by one line (264 twips / 13.2pt):
added that much extra spacing before "Best Regards," and shifted the
signature's own offset down by the same amount, so their relative
position to each other is unchanged - only their distance from the
table above increases.

Still comfortably within the page-count budget (about 386 twips of net
slack remains from the earlier table-row trim, well over the ~65-100
twip margin the 3rd-page fix originally needed).

Co-Authored-By: Claude Sonnet 5 <noreply@anthropic.com>
Claude-Session: https://claude.ai/code/session_01MEHPF7p4Mvi3Bv2am4sPQK
</commit_message>
<xml_diff>
--- a/hr-ai-interviewer/backend/src/templates/increment-letter.docx
+++ b/hr-ai-interviewer/backend/src/templates/increment-letter.docx
@@ -1211,7 +1211,7 @@
               <wp:posOffset>-33020</wp:posOffset>
             </wp:positionH>
             <wp:positionV relativeFrom="paragraph">
-              <wp:posOffset>4975387</wp:posOffset>
+              <wp:posOffset>5143027</wp:posOffset>
             </wp:positionV>
             <wp:extent cx="565785" cy="565150"/>
             <wp:effectExtent l="0" t="0" r="5715" b="6350"/>
@@ -3258,7 +3258,7 @@
     </w:tbl>
     <w:p>
       <w:pPr>
-        <w:spacing w:after="350"/>
+        <w:spacing w:after="614"/>
         <w:rPr>
           <w:rFonts w:ascii="Sylfaen" w:hAnsi="Sylfaen" w:cs="Arial"/>
         </w:rPr>

</xml_diff>